<commit_message>
Save metadata about target.pk associated with each AssetDatapoint [skip-ci]
</commit_message>
<xml_diff>
--- a/tests/_fixtures/book-content-examples/metadata_extraction.docx
+++ b/tests/_fixtures/book-content-examples/metadata_extraction.docx
@@ -2,6 +2,68 @@
 <file path=word/document.xml><?xml version="1.0" encoding="utf-8"?>
 <w:document xmlns:wpc="http://schemas.microsoft.com/office/word/2010/wordprocessingCanvas" xmlns:cx="http://schemas.microsoft.com/office/drawing/2014/chartex" xmlns:cx1="http://schemas.microsoft.com/office/drawing/2015/9/8/chartex" xmlns:cx2="http://schemas.microsoft.com/office/drawing/2015/10/21/chartex" xmlns:cx3="http://schemas.microsoft.com/office/drawing/2016/5/9/chartex" xmlns:cx4="http://schemas.microsoft.com/office/drawing/2016/5/10/chartex" xmlns:cx5="http://schemas.microsoft.com/office/drawing/2016/5/11/chartex" xmlns:cx6="http://schemas.microsoft.com/office/drawing/2016/5/12/chartex" xmlns:cx7="http://schemas.microsoft.com/office/drawing/2016/5/13/chartex" xmlns:cx8="http://schemas.microsoft.com/office/drawing/2016/5/14/chartex" xmlns:mc="http://schemas.openxmlformats.org/markup-compatibility/2006" xmlns:aink="http://schemas.microsoft.com/office/drawing/2016/ink" xmlns:am3d="http://schemas.microsoft.com/office/drawing/2017/model3d" xmlns:o="urn:schemas-microsoft-com:office:office" xmlns:oel="http://schemas.microsoft.com/office/2019/extlst" xmlns:r="http://schemas.openxmlformats.org/officeDocument/2006/relationships" xmlns:m="http://schemas.openxmlformats.org/officeDocument/2006/math" xmlns:v="urn:schemas-microsoft-com:vml" xmlns:wp14="http://schemas.microsoft.com/office/word/2010/wordprocessingDrawing" xmlns:wp="http://schemas.openxmlformats.org/drawingml/2006/wordprocessingDrawing" xmlns:w10="urn:schemas-microsoft-com:office:word" xmlns:w="http://schemas.openxmlformats.org/wordprocessingml/2006/main" xmlns:w14="http://schemas.microsoft.com/office/word/2010/wordml" xmlns:w15="http://schemas.microsoft.com/office/word/2012/wordml" xmlns:w16cex="http://schemas.microsoft.com/office/word/2018/wordml/cex" xmlns:w16cid="http://schemas.microsoft.com/office/word/2016/wordml/cid" xmlns:w16="http://schemas.microsoft.com/office/word/2018/wordml" xmlns:w16du="http://schemas.microsoft.com/office/word/2023/wordml/word16du" xmlns:w16sdtdh="http://schemas.microsoft.com/office/word/2020/wordml/sdtdatahash" xmlns:w16sdtfl="http://schemas.microsoft.com/office/word/2024/wordml/sdtformatlock" xmlns:w16se="http://schemas.microsoft.com/office/word/2015/wordml/symex" xmlns:wpg="http://schemas.microsoft.com/office/word/2010/wordprocessingGroup" xmlns:wpi="http://schemas.microsoft.com/office/word/2010/wordprocessingInk" xmlns:wne="http://schemas.microsoft.com/office/word/2006/wordml" xmlns:wps="http://schemas.microsoft.com/office/word/2010/wordprocessingShape" mc:Ignorable="w14 w15 w16se w16cid w16 w16cex w16sdtdh w16sdtfl w16du wp14">
   <w:body>
+    <w:p/>
+    <w:p>
+      <w:pPr>
+        <w:pStyle w:val="Caption"/>
+      </w:pPr>
+      <w:bookmarkStart w:id="0" w:name="fig1RedSquare"/>
+      <w:r>
+        <w:rPr>
+          <w:b/>
+          <w:bCs/>
+        </w:rPr>
+        <w:t xml:space="preserve">Figure </w:t>
+      </w:r>
+      <w:r>
+        <w:rPr>
+          <w:b/>
+          <w:bCs/>
+        </w:rPr>
+        <w:fldChar w:fldCharType="begin"/>
+      </w:r>
+      <w:r>
+        <w:rPr>
+          <w:b/>
+          <w:bCs/>
+        </w:rPr>
+        <w:instrText xml:space="preserve"> SEQ Figure \* ARABIC </w:instrText>
+      </w:r>
+      <w:r>
+        <w:rPr>
+          <w:b/>
+          <w:bCs/>
+        </w:rPr>
+        <w:fldChar w:fldCharType="separate"/>
+      </w:r>
+      <w:r>
+        <w:rPr>
+          <w:b/>
+          <w:bCs/>
+          <w:noProof/>
+        </w:rPr>
+        <w:t>1</w:t>
+      </w:r>
+      <w:r>
+        <w:rPr>
+          <w:b/>
+          <w:bCs/>
+        </w:rPr>
+        <w:fldChar w:fldCharType="end"/>
+      </w:r>
+      <w:r>
+        <w:rPr>
+          <w:b/>
+          <w:bCs/>
+        </w:rPr>
+        <w:t>:</w:t>
+      </w:r>
+      <w:r>
+        <w:t xml:space="preserve"> Red square.</w:t>
+      </w:r>
+    </w:p>
+    <w:bookmarkEnd w:id="0"/>
+    <w:p/>
     <w:p>
       <w:r>
         <w:pict w14:anchorId="49783914">
@@ -24,7 +86,7 @@
             <v:path o:extrusionok="f" gradientshapeok="t" o:connecttype="rect"/>
             <o:lock v:ext="edit" aspectratio="t"/>
           </v:shapetype>
-          <v:shape id="_x0000_i1025" type="#_x0000_t75" style="width:7.5pt;height:7.5pt;visibility:visible;mso-wrap-style:square">
+          <v:shape id="_x0000_i1025" type="#_x0000_t75" style="width:7.45pt;height:7.45pt;visibility:visible;mso-wrap-style:square">
             <v:imagedata r:id="rId5" o:title=""/>
           </v:shape>
         </w:pict>
@@ -189,21 +251,12 @@
                 <w:szCs w:val="18"/>
               </w:rPr>
             </w:pPr>
-            <w:proofErr w:type="spellStart"/>
-            <w:r>
-              <w:rPr>
-                <w:sz w:val="18"/>
-                <w:szCs w:val="18"/>
-              </w:rPr>
-              <w:t>Unsplash</w:t>
-            </w:r>
-            <w:proofErr w:type="spellEnd"/>
-            <w:r>
-              <w:rPr>
-                <w:sz w:val="18"/>
-                <w:szCs w:val="18"/>
-              </w:rPr>
-              <w:t xml:space="preserve"> License</w:t>
+            <w:r>
+              <w:rPr>
+                <w:sz w:val="18"/>
+                <w:szCs w:val="18"/>
+              </w:rPr>
+              <w:t>copyleft</w:t>
             </w:r>
           </w:p>
         </w:tc>
@@ -275,7 +328,7 @@
                 <w:sz w:val="18"/>
                 <w:szCs w:val="18"/>
               </w:rPr>
-              <w:t>Jean Carlo Emer</w:t>
+              <w:t>Unknown</w:t>
             </w:r>
           </w:p>
         </w:tc>
@@ -357,14 +410,14 @@
             <w:pPr>
               <w:pStyle w:val="Compact"/>
               <w:rPr>
-                <w:sz w:val="18"/>
-                <w:szCs w:val="18"/>
-              </w:rPr>
-            </w:pPr>
-            <w:r>
-              <w:rPr>
-                <w:sz w:val="18"/>
-                <w:szCs w:val="18"/>
+                <w:sz w:val="16"/>
+                <w:szCs w:val="16"/>
+              </w:rPr>
+            </w:pPr>
+            <w:r>
+              <w:rPr>
+                <w:sz w:val="16"/>
+                <w:szCs w:val="16"/>
               </w:rPr>
               <w:t>##Alt-text</w:t>
             </w:r>
@@ -377,8 +430,16 @@
           <w:p>
             <w:pPr>
               <w:pStyle w:val="Compact"/>
-            </w:pPr>
-            <w:r>
+              <w:rPr>
+                <w:sz w:val="18"/>
+                <w:szCs w:val="18"/>
+              </w:rPr>
+            </w:pPr>
+            <w:r>
+              <w:rPr>
+                <w:sz w:val="18"/>
+                <w:szCs w:val="18"/>
+              </w:rPr>
               <w:t xml:space="preserve"> Red square</w:t>
             </w:r>
           </w:p>
@@ -393,21 +454,21 @@
             <w:pPr>
               <w:pStyle w:val="Compact"/>
               <w:rPr>
-                <w:sz w:val="18"/>
-                <w:szCs w:val="18"/>
-              </w:rPr>
-            </w:pPr>
-            <w:r>
-              <w:rPr>
-                <w:sz w:val="18"/>
-                <w:szCs w:val="18"/>
+                <w:sz w:val="16"/>
+                <w:szCs w:val="16"/>
+              </w:rPr>
+            </w:pPr>
+            <w:r>
+              <w:rPr>
+                <w:sz w:val="16"/>
+                <w:szCs w:val="16"/>
               </w:rPr>
               <w:t>##Colo</w:t>
             </w:r>
             <w:r>
               <w:rPr>
-                <w:sz w:val="18"/>
-                <w:szCs w:val="18"/>
+                <w:sz w:val="16"/>
+                <w:szCs w:val="16"/>
               </w:rPr>
               <w:t>ur</w:t>
             </w:r>
@@ -420,8 +481,16 @@
           <w:p>
             <w:pPr>
               <w:pStyle w:val="Compact"/>
-            </w:pPr>
-            <w:r>
+              <w:rPr>
+                <w:sz w:val="18"/>
+                <w:szCs w:val="18"/>
+              </w:rPr>
+            </w:pPr>
+            <w:r>
+              <w:rPr>
+                <w:sz w:val="18"/>
+                <w:szCs w:val="18"/>
+              </w:rPr>
               <w:t>no</w:t>
             </w:r>
           </w:p>
@@ -436,16 +505,16 @@
             <w:pPr>
               <w:pStyle w:val="Compact"/>
               <w:rPr>
-                <w:sz w:val="18"/>
-                <w:szCs w:val="18"/>
-              </w:rPr>
-            </w:pPr>
-            <w:r>
-              <w:rPr>
-                <w:i/>
-                <w:iCs/>
-                <w:sz w:val="18"/>
-                <w:szCs w:val="18"/>
+                <w:sz w:val="16"/>
+                <w:szCs w:val="16"/>
+              </w:rPr>
+            </w:pPr>
+            <w:r>
+              <w:rPr>
+                <w:i/>
+                <w:iCs/>
+                <w:sz w:val="16"/>
+                <w:szCs w:val="16"/>
               </w:rPr>
               <w:t>##Remove-previous</w:t>
             </w:r>
@@ -458,20 +527,85 @@
           <w:p>
             <w:pPr>
               <w:pStyle w:val="Compact"/>
-            </w:pPr>
-            <w:r>
+              <w:rPr>
+                <w:sz w:val="18"/>
+                <w:szCs w:val="18"/>
+              </w:rPr>
+            </w:pPr>
+            <w:r>
+              <w:rPr>
+                <w:sz w:val="18"/>
+                <w:szCs w:val="18"/>
+              </w:rPr>
               <w:t>Please delete</w:t>
             </w:r>
           </w:p>
         </w:tc>
       </w:tr>
     </w:tbl>
+    <w:p/>
+    <w:p>
+      <w:r>
+        <w:t xml:space="preserve">Link to </w:t>
+      </w:r>
+      <w:hyperlink w:anchor="fig1RedSquare" w:history="1">
+        <w:r>
+          <w:rPr>
+            <w:rStyle w:val="Hyperlink"/>
+          </w:rPr>
+          <w:t>Figure 1 (link to bookmark)</w:t>
+        </w:r>
+      </w:hyperlink>
+      <w:r>
+        <w:t xml:space="preserve"> </w:t>
+      </w:r>
+      <w:r>
+        <w:t>[lookbehind]</w:t>
+      </w:r>
+      <w:r>
+        <w:t xml:space="preserve">, link to </w:t>
+      </w:r>
+      <w:r>
+        <w:fldChar w:fldCharType="begin"/>
+      </w:r>
+      <w:r>
+        <w:instrText xml:space="preserve"> REF _Ref191564298 \h  \* MERGEFORMAT </w:instrText>
+      </w:r>
+      <w:r>
+        <w:fldChar w:fldCharType="separate"/>
+      </w:r>
+      <w:r>
+        <w:t xml:space="preserve">Figure </w:t>
+      </w:r>
+      <w:r>
+        <w:rPr>
+          <w:noProof/>
+        </w:rPr>
+        <w:t>2</w:t>
+      </w:r>
+      <w:r>
+        <w:fldChar w:fldCharType="end"/>
+      </w:r>
+      <w:r>
+        <w:t xml:space="preserve"> (cross-ref)</w:t>
+      </w:r>
+      <w:r>
+        <w:t xml:space="preserve"> [</w:t>
+      </w:r>
+      <w:r>
+        <w:t>lookahead]</w:t>
+      </w:r>
+      <w:r>
+        <w:t>.</w:t>
+      </w:r>
+    </w:p>
     <w:p/>
     <w:p>
       <w:pPr>
         <w:pStyle w:val="Caption"/>
         <w:spacing w:after="0"/>
       </w:pPr>
+      <w:bookmarkStart w:id="1" w:name="_Ref191564298"/>
       <w:r>
         <w:rPr>
           <w:b/>
@@ -506,7 +640,7 @@
           <w:bCs/>
           <w:noProof/>
         </w:rPr>
-        <w:t>1</w:t>
+        <w:t>2</w:t>
       </w:r>
       <w:r>
         <w:rPr>
@@ -515,6 +649,7 @@
         </w:rPr>
         <w:fldChar w:fldCharType="end"/>
       </w:r>
+      <w:bookmarkEnd w:id="1"/>
       <w:r>
         <w:rPr>
           <w:b/>
@@ -883,8 +1018,8 @@
               <w:rPr>
                 <w:i/>
                 <w:iCs/>
-                <w:sz w:val="18"/>
-                <w:szCs w:val="18"/>
+                <w:sz w:val="16"/>
+                <w:szCs w:val="16"/>
               </w:rPr>
               <w:t>##Remove-previous</w:t>
             </w:r>
@@ -1773,7 +1908,13 @@
     <w:p/>
     <w:p>
       <w:r>
-        <w:t>Just a sentence to make sure that it won’t be removed.</w:t>
+        <w:t>Just a sentence to make sure that it won’t be removed</w:t>
+      </w:r>
+      <w:r>
+        <w:t xml:space="preserve"> during metadata tables removal</w:t>
+      </w:r>
+      <w:r>
+        <w:t>.</w:t>
       </w:r>
     </w:p>
     <w:p/>
@@ -1782,6 +1923,7 @@
         <w:t>Another sentence.</w:t>
       </w:r>
     </w:p>
+    <w:p/>
     <w:sectPr>
       <w:pgSz w:w="12240" w:h="15840"/>
       <w:pgMar w:top="1440" w:right="1440" w:bottom="1440" w:left="1440" w:header="720" w:footer="720" w:gutter="0"/>
@@ -2299,6 +2441,18 @@
       <w:szCs w:val="18"/>
     </w:rPr>
   </w:style>
+  <w:style w:type="character" w:styleId="UnresolvedMention">
+    <w:name w:val="Unresolved Mention"/>
+    <w:basedOn w:val="DefaultParagraphFont"/>
+    <w:uiPriority w:val="99"/>
+    <w:semiHidden/>
+    <w:unhideWhenUsed/>
+    <w:rsid w:val="004C3B0D"/>
+    <w:rPr>
+      <w:color w:val="605E5C"/>
+      <w:shd w:val="clear" w:color="auto" w:fill="E1DFDD"/>
+    </w:rPr>
+  </w:style>
 </w:styles>
 </file>
 

</xml_diff>

<commit_message>
Update example for testing metadata extraction
</commit_message>
<xml_diff>
--- a/tests/_fixtures/book-content-examples/metadata_extraction.docx
+++ b/tests/_fixtures/book-content-examples/metadata_extraction.docx
@@ -1921,6 +1921,45 @@
     <w:p>
       <w:r>
         <w:t>Another sentence.</w:t>
+      </w:r>
+      <w:r>
+        <w:t xml:space="preserve"> Second link to </w:t>
+      </w:r>
+      <w:r>
+        <w:fldChar w:fldCharType="begin"/>
+      </w:r>
+      <w:r>
+        <w:instrText xml:space="preserve"> REF _Ref191564298 \h </w:instrText>
+      </w:r>
+      <w:r>
+        <w:instrText xml:space="preserve"> \* MERGEFORMAT </w:instrText>
+      </w:r>
+      <w:r>
+        <w:fldChar w:fldCharType="separate"/>
+      </w:r>
+      <w:r>
+        <w:t xml:space="preserve">Figure </w:t>
+      </w:r>
+      <w:r>
+        <w:rPr>
+          <w:noProof/>
+        </w:rPr>
+        <w:t>2</w:t>
+      </w:r>
+      <w:r>
+        <w:fldChar w:fldCharType="end"/>
+      </w:r>
+      <w:r>
+        <w:t xml:space="preserve"> </w:t>
+      </w:r>
+      <w:r>
+        <w:t>[</w:t>
+      </w:r>
+      <w:r>
+        <w:t>lookbehind</w:t>
+      </w:r>
+      <w:r>
+        <w:t>].</w:t>
       </w:r>
     </w:p>
     <w:p/>

</xml_diff>